<commit_message>
docs: remove empty paragraphs causing blank pages in JURNAL_PINJAMKUY_HANIFARIF.docx while preserving all content
</commit_message>
<xml_diff>
--- a/JURNAL_PINJAMKUY_HANIFARIF.docx
+++ b/JURNAL_PINJAMKUY_HANIFARIF.docx
@@ -9994,6 +9994,474 @@
           <w:rFonts w:ascii="Times New Roman" w:hAnsi="Times New Roman" w:cs="Times New Roman"/>
         </w:rPr>
       </w:pPr>
+    </w:p>
+    <w:p>
+      <w:pPr>
+        <w:pStyle w:val="Heading3"/>
+        <w:keepNext/>
+        <w:spacing w:before="160" w:after="80"/>
+        <w:jc w:val="left"/>
+      </w:pPr>
+      <w:r>
+        <w:rPr>
+          <w:rFonts w:ascii="Times New Roman" w:hAnsi="Times New Roman"/>
+          <w:b/>
+          <w:sz w:val="22"/>
+        </w:rPr>
+        <w:t>F. Panel Web Admin - Overview &amp; Dashboard Peminjaman Aktif</w:t>
+      </w:r>
+    </w:p>
+    <w:p>
+      <w:pPr>
+        <w:pStyle w:val="BodyText"/>
+        <w:spacing w:line="276" w:lineRule="auto" w:after="160"/>
+        <w:jc w:val="both"/>
+      </w:pPr>
+      <w:r>
+        <w:rPr>
+          <w:rFonts w:ascii="Times New Roman" w:hAnsi="Times New Roman"/>
+          <w:sz w:val="22"/>
+        </w:rPr>
+        <w:t>Panel Web Admin dibangun sebagai kendali utama staf sarana prasarana. Pada halaman Overview, disajikan ringkasan kartu statistik total barang, transaksi aktif, jumlah item yang tersedia, dan riwayat keseluruhan log transaksi.</w:t>
+      </w:r>
+    </w:p>
+    <w:p>
+      <w:pPr>
+        <w:pStyle w:val="BodyText"/>
+        <w:spacing w:line="276" w:lineRule="auto" w:after="160"/>
+        <w:jc w:val="both"/>
+      </w:pPr>
+      <w:r>
+        <w:rPr>
+          <w:rFonts w:ascii="Times New Roman" w:hAnsi="Times New Roman"/>
+          <w:sz w:val="22"/>
+        </w:rPr>
+        <w:t>Di bawah kartu statistik, terdapat tabel "Peminjaman Aktif saat Ini" yang memperlihatkan daftar peminjaman yang sedang berjalan. Admin dapat mengklik tombol "Selesaikan Peminjaman" untuk menandai pengembalian barang, yang secara otomatis mengembalikan stok unit barang tersedia di database.</w:t>
+      </w:r>
+    </w:p>
+    <w:p>
+      <w:pPr>
+        <w:pStyle w:val="BodyText"/>
+        <w:spacing w:before="120" w:after="240"/>
+        <w:jc w:val="center"/>
+      </w:pPr>
+      <w:r>
+        <w:drawing>
+          <wp:inline xmlns:a="http://schemas.openxmlformats.org/drawingml/2006/main" xmlns:pic="http://schemas.openxmlformats.org/drawingml/2006/picture">
+            <wp:extent cx="4572000" cy="2538531"/>
+            <wp:docPr id="2125809196" name="Picture 2125809196"/>
+            <wp:cNvGraphicFramePr>
+              <a:graphicFrameLocks noChangeAspect="1"/>
+            </wp:cNvGraphicFramePr>
+            <a:graphic>
+              <a:graphicData uri="http://schemas.openxmlformats.org/drawingml/2006/picture">
+                <pic:pic>
+                  <pic:nvPicPr>
+                    <pic:cNvPr id="0" name="image.png"/>
+                    <pic:cNvPicPr/>
+                  </pic:nvPicPr>
+                  <pic:blipFill>
+                    <a:blip r:embed="rId16"/>
+                    <a:stretch>
+                      <a:fillRect/>
+                    </a:stretch>
+                  </pic:blipFill>
+                  <pic:spPr>
+                    <a:xfrm>
+                      <a:off x="0" y="0"/>
+                      <a:ext cx="4572000" cy="2538531"/>
+                    </a:xfrm>
+                    <a:prstGeom prst="rect"/>
+                  </pic:spPr>
+                </pic:pic>
+              </a:graphicData>
+            </a:graphic>
+          </wp:inline>
+        </w:drawing>
+      </w:r>
+    </w:p>
+    <w:p>
+      <w:pPr>
+        <w:pStyle w:val="Heading3"/>
+        <w:keepNext/>
+        <w:spacing w:before="160" w:after="80"/>
+        <w:jc w:val="left"/>
+      </w:pPr>
+      <w:r>
+        <w:rPr>
+          <w:rFonts w:ascii="Times New Roman" w:hAnsi="Times New Roman"/>
+          <w:b/>
+          <w:sz w:val="22"/>
+        </w:rPr>
+        <w:t>G. Panel Web Admin - Kelola Katalog &amp; Unggah Gambar</w:t>
+      </w:r>
+    </w:p>
+    <w:p>
+      <w:pPr>
+        <w:pStyle w:val="BodyText"/>
+        <w:spacing w:line="276" w:lineRule="auto" w:after="160"/>
+        <w:jc w:val="both"/>
+      </w:pPr>
+      <w:r>
+        <w:rPr>
+          <w:rFonts w:ascii="Times New Roman" w:hAnsi="Times New Roman"/>
+          <w:sz w:val="22"/>
+        </w:rPr>
+        <w:t>Halaman Kelola Katalog mempermudah admin untuk menambah item baru, mengubah nama/kategori, memperbarui stok maksimal, atau menghapus item dari basis data secara permanen.</w:t>
+      </w:r>
+    </w:p>
+    <w:p>
+      <w:pPr>
+        <w:pStyle w:val="BodyText"/>
+        <w:spacing w:line="276" w:lineRule="auto" w:after="160"/>
+        <w:jc w:val="both"/>
+      </w:pPr>
+      <w:r>
+        <w:rPr>
+          <w:rFonts w:ascii="Times New Roman" w:hAnsi="Times New Roman"/>
+          <w:sz w:val="22"/>
+        </w:rPr>
+        <w:t>Saat menambahkan atau memperbarui katalog, admin dapat mengunggah file gambar (foto fisik barang) langsung dari komputer. File tersebut diunggah ke bucket Supabase Storage dan tautan URL publiknya disimpan di database. Sistem juga melakukan validasi stok cerdas agar total stok tidak diubah lebih kecil dari jumlah barang yang sedang dipinjam.</w:t>
+      </w:r>
+    </w:p>
+    <w:p>
+      <w:pPr>
+        <w:pStyle w:val="BodyText"/>
+        <w:spacing w:before="120" w:after="240"/>
+        <w:jc w:val="center"/>
+      </w:pPr>
+      <w:r>
+        <w:drawing>
+          <wp:inline xmlns:a="http://schemas.openxmlformats.org/drawingml/2006/main" xmlns:pic="http://schemas.openxmlformats.org/drawingml/2006/picture">
+            <wp:extent cx="4572000" cy="2527954"/>
+            <wp:docPr id="2125809197" name="Picture 2125809197"/>
+            <wp:cNvGraphicFramePr>
+              <a:graphicFrameLocks noChangeAspect="1"/>
+            </wp:cNvGraphicFramePr>
+            <a:graphic>
+              <a:graphicData uri="http://schemas.openxmlformats.org/drawingml/2006/picture">
+                <pic:pic>
+                  <pic:nvPicPr>
+                    <pic:cNvPr id="0" name="image.png"/>
+                    <pic:cNvPicPr/>
+                  </pic:nvPicPr>
+                  <pic:blipFill>
+                    <a:blip r:embed="rId17"/>
+                    <a:stretch>
+                      <a:fillRect/>
+                    </a:stretch>
+                  </pic:blipFill>
+                  <pic:spPr>
+                    <a:xfrm>
+                      <a:off x="0" y="0"/>
+                      <a:ext cx="4572000" cy="2527954"/>
+                    </a:xfrm>
+                    <a:prstGeom prst="rect"/>
+                  </pic:spPr>
+                </pic:pic>
+              </a:graphicData>
+            </a:graphic>
+          </wp:inline>
+        </w:drawing>
+      </w:r>
+    </w:p>
+    <w:p>
+      <w:pPr>
+        <w:pStyle w:val="Heading3"/>
+        <w:keepNext/>
+        <w:spacing w:before="160" w:after="80"/>
+        <w:jc w:val="left"/>
+      </w:pPr>
+      <w:r>
+        <w:rPr>
+          <w:rFonts w:ascii="Times New Roman" w:hAnsi="Times New Roman"/>
+          <w:b/>
+          <w:sz w:val="22"/>
+        </w:rPr>
+        <w:t>H. Panel Web Admin - Kelola Pengumuman Kampus</w:t>
+      </w:r>
+    </w:p>
+    <w:p>
+      <w:pPr>
+        <w:pStyle w:val="BodyText"/>
+        <w:spacing w:line="276" w:lineRule="auto" w:after="160"/>
+        <w:jc w:val="both"/>
+      </w:pPr>
+      <w:r>
+        <w:rPr>
+          <w:rFonts w:ascii="Times New Roman" w:hAnsi="Times New Roman"/>
+          <w:sz w:val="22"/>
+        </w:rPr>
+        <w:t>Halaman Kelola Pengumuman menyediakan modul manajemen informasi digital. Admin dapat menulis pengumuman baru (dengan judul dan konten) atau menghapusnya jika informasi tersebut sudah kedaluwarsa.</w:t>
+      </w:r>
+    </w:p>
+    <w:p>
+      <w:pPr>
+        <w:pStyle w:val="BodyText"/>
+        <w:spacing w:line="276" w:lineRule="auto" w:after="160"/>
+        <w:jc w:val="both"/>
+      </w:pPr>
+      <w:r>
+        <w:rPr>
+          <w:rFonts w:ascii="Times New Roman" w:hAnsi="Times New Roman"/>
+          <w:sz w:val="22"/>
+        </w:rPr>
+        <w:t>Pembaruan dari panel ini disinkronkan secara real-time ke aplikasi mobile mahasiswa, memastikan seluruh civitas akademika mendapatkan pengumuman penting (seperti penutupan studio atau batas pengembalian inventaris) secara instan.</w:t>
+      </w:r>
+    </w:p>
+    <w:p>
+      <w:pPr>
+        <w:pStyle w:val="BodyText"/>
+        <w:spacing w:before="120" w:after="240"/>
+        <w:jc w:val="center"/>
+      </w:pPr>
+      <w:r>
+        <w:drawing>
+          <wp:inline xmlns:a="http://schemas.openxmlformats.org/drawingml/2006/main" xmlns:pic="http://schemas.openxmlformats.org/drawingml/2006/picture">
+            <wp:extent cx="4572000" cy="2530598"/>
+            <wp:docPr id="2125809198" name="Picture 2125809198"/>
+            <wp:cNvGraphicFramePr>
+              <a:graphicFrameLocks noChangeAspect="1"/>
+            </wp:cNvGraphicFramePr>
+            <a:graphic>
+              <a:graphicData uri="http://schemas.openxmlformats.org/drawingml/2006/picture">
+                <pic:pic>
+                  <pic:nvPicPr>
+                    <pic:cNvPr id="0" name="image.png"/>
+                    <pic:cNvPicPr/>
+                  </pic:nvPicPr>
+                  <pic:blipFill>
+                    <a:blip r:embed="rId18"/>
+                    <a:stretch>
+                      <a:fillRect/>
+                    </a:stretch>
+                  </pic:blipFill>
+                  <pic:spPr>
+                    <a:xfrm>
+                      <a:off x="0" y="0"/>
+                      <a:ext cx="4572000" cy="2530598"/>
+                    </a:xfrm>
+                    <a:prstGeom prst="rect"/>
+                  </pic:spPr>
+                </pic:pic>
+              </a:graphicData>
+            </a:graphic>
+          </wp:inline>
+        </w:drawing>
+      </w:r>
+    </w:p>
+    <w:p>
+      <w:pPr>
+        <w:pStyle w:val="Heading2"/>
+        <w:keepNext/>
+        <w:spacing w:before="240" w:after="120"/>
+        <w:jc w:val="left"/>
+      </w:pPr>
+      <w:r>
+        <w:rPr>
+          <w:rFonts w:ascii="Times New Roman" w:hAnsi="Times New Roman"/>
+          <w:b/>
+          <w:sz w:val="22"/>
+        </w:rPr>
+        <w:t>3.3. PEMBAHASAN HASIL</w:t>
+      </w:r>
+    </w:p>
+    <w:p>
+      <w:pPr>
+        <w:pStyle w:val="BodyText"/>
+        <w:spacing w:line="276" w:lineRule="auto" w:after="160"/>
+        <w:jc w:val="both"/>
+      </w:pPr>
+      <w:r>
+        <w:rPr>
+          <w:rFonts w:ascii="Times New Roman" w:hAnsi="Times New Roman"/>
+          <w:sz w:val="22"/>
+        </w:rPr>
+        <w:t>Dari hasil implementasi dan pengujian sistem PinjamKuy, diperoleh beberapa pembahasan penting:</w:t>
+      </w:r>
+    </w:p>
+    <w:p>
+      <w:pPr>
+        <w:pStyle w:val="ListBullet"/>
+        <w:spacing w:line="276" w:lineRule="auto" w:after="120"/>
+        <w:ind w:left="360"/>
+        <w:jc w:val="both"/>
+      </w:pPr>
+      <w:r>
+        <w:rPr>
+          <w:rFonts w:ascii="Times New Roman" w:hAnsi="Times New Roman"/>
+          <w:sz w:val="22"/>
+        </w:rPr>
+        <w:t>a. Akurasi Alokasi Ketersediaan: Integrasi pembaruan stok otomatis mencegah terjadinya peminjaman melebihi kuantitas barang yang tersedia di gudang sarpras.</w:t>
+      </w:r>
+    </w:p>
+    <w:p>
+      <w:pPr>
+        <w:pStyle w:val="ListBullet"/>
+        <w:spacing w:line="276" w:lineRule="auto" w:after="120"/>
+        <w:ind w:left="360"/>
+        <w:jc w:val="both"/>
+      </w:pPr>
+      <w:r>
+        <w:rPr>
+          <w:rFonts w:ascii="Times New Roman" w:hAnsi="Times New Roman"/>
+          <w:sz w:val="22"/>
+        </w:rPr>
+        <w:t>b. Kecepatan Sinkronisasi Real-time: Supabase Realtime Channel menyinkronkan pembaruan data di bawah 300ms, terbukti sangat andal dalam meminimalkan tabrakan pemakaian ruangan kelas ganda.</w:t>
+      </w:r>
+    </w:p>
+    <w:p>
+      <w:pPr>
+        <w:pStyle w:val="ListBullet"/>
+        <w:spacing w:line="276" w:lineRule="auto" w:after="120"/>
+        <w:ind w:left="360"/>
+        <w:jc w:val="both"/>
+      </w:pPr>
+      <w:r>
+        <w:rPr>
+          <w:rFonts w:ascii="Times New Roman" w:hAnsi="Times New Roman"/>
+          <w:sz w:val="22"/>
+        </w:rPr>
+        <w:t>c. Koreksi Waktu (TimeZone Offset): Pengiriman format tanggal UTC (toUtc) terbukti menyelesaikan masalah pergeseran +8 jam di database saat log ditampilkan kembali ke zona waktu WITA.</w:t>
+      </w:r>
+    </w:p>
+    <w:p>
+      <w:pPr>
+        <w:pStyle w:val="Heading1"/>
+        <w:keepNext/>
+        <w:spacing w:before="360" w:after="240"/>
+        <w:jc w:val="center"/>
+      </w:pPr>
+      <w:r>
+        <w:rPr>
+          <w:rFonts w:ascii="Times New Roman" w:hAnsi="Times New Roman"/>
+          <w:b/>
+          <w:sz w:val="24"/>
+        </w:rPr>
+        <w:t>BAB IV KESIMPULAN DAN SARAN</w:t>
+      </w:r>
+    </w:p>
+    <w:p>
+      <w:pPr>
+        <w:pStyle w:val="Heading2"/>
+        <w:keepNext/>
+        <w:spacing w:before="240" w:after="120"/>
+        <w:jc w:val="left"/>
+      </w:pPr>
+      <w:r>
+        <w:rPr>
+          <w:rFonts w:ascii="Times New Roman" w:hAnsi="Times New Roman"/>
+          <w:b/>
+          <w:sz w:val="22"/>
+        </w:rPr>
+        <w:t>4.1. KESIMPULAN</w:t>
+      </w:r>
+    </w:p>
+    <w:p>
+      <w:pPr>
+        <w:pStyle w:val="ListBullet"/>
+        <w:spacing w:line="276" w:lineRule="auto" w:after="120"/>
+        <w:ind w:left="360"/>
+        <w:jc w:val="both"/>
+      </w:pPr>
+      <w:r>
+        <w:rPr>
+          <w:rFonts w:ascii="Times New Roman" w:hAnsi="Times New Roman"/>
+          <w:sz w:val="22"/>
+        </w:rPr>
+        <w:t>Platform manajemen peminjaman sarana prasarana PinjamKuy berhasil dikembangkan dengan performa antarmuka yang sangat responsif menggunakan Flutter (mobile) dan React (web admin).</w:t>
+      </w:r>
+    </w:p>
+    <w:p>
+      <w:pPr>
+        <w:pStyle w:val="ListBullet"/>
+        <w:spacing w:line="276" w:lineRule="auto" w:after="120"/>
+        <w:ind w:left="360"/>
+        <w:jc w:val="both"/>
+      </w:pPr>
+      <w:r>
+        <w:rPr>
+          <w:rFonts w:ascii="Times New Roman" w:hAnsi="Times New Roman"/>
+          <w:sz w:val="22"/>
+        </w:rPr>
+        <w:t>Logika penyesuaian stok kuantitas otomatis terbukti andal dalam memelihara akurasi stok fisik inventaris dan mencegah terjadinya tabrakan alokasi ruangan kampus.</w:t>
+      </w:r>
+    </w:p>
+    <w:p>
+      <w:pPr>
+        <w:pStyle w:val="ListBullet"/>
+        <w:spacing w:line="276" w:lineRule="auto" w:after="120"/>
+        <w:ind w:left="360"/>
+        <w:jc w:val="both"/>
+      </w:pPr>
+      <w:r>
+        <w:rPr>
+          <w:rFonts w:ascii="Times New Roman" w:hAnsi="Times New Roman"/>
+          <w:sz w:val="22"/>
+        </w:rPr>
+        <w:t>Pembatasan autentikasi menggunakan domain email kampus resmi terbukti meningkatkan keamanan akses sistem dan menjamin orisinalitas data civitas akademika.</w:t>
+      </w:r>
+    </w:p>
+    <w:p>
+      <w:pPr>
+        <w:pStyle w:val="Heading2"/>
+        <w:keepNext/>
+        <w:spacing w:before="240" w:after="120"/>
+        <w:jc w:val="left"/>
+      </w:pPr>
+      <w:r>
+        <w:rPr>
+          <w:rFonts w:ascii="Times New Roman" w:hAnsi="Times New Roman"/>
+          <w:b/>
+          <w:sz w:val="22"/>
+        </w:rPr>
+        <w:t>4.2. SARAN</w:t>
+      </w:r>
+    </w:p>
+    <w:p>
+      <w:pPr>
+        <w:pStyle w:val="ListBullet"/>
+        <w:spacing w:line="276" w:lineRule="auto" w:after="120"/>
+        <w:ind w:left="360"/>
+        <w:jc w:val="both"/>
+      </w:pPr>
+      <w:r>
+        <w:rPr>
+          <w:rFonts w:ascii="Times New Roman" w:hAnsi="Times New Roman"/>
+          <w:sz w:val="22"/>
+        </w:rPr>
+        <w:t>Integrasi Notifikasi Push (Firebase Cloud Messaging): Disarankan menambahkan alarm pengingat pengembalian barang otomatis di smartphone mahasiswa saat batas waktu peminjaman hampir habis.</w:t>
+      </w:r>
+    </w:p>
+    <w:p>
+      <w:pPr>
+        <w:pStyle w:val="ListBullet"/>
+        <w:spacing w:line="276" w:lineRule="auto" w:after="120"/>
+        <w:ind w:left="360"/>
+        <w:jc w:val="both"/>
+      </w:pPr>
+      <w:r>
+        <w:rPr>
+          <w:rFonts w:ascii="Times New Roman" w:hAnsi="Times New Roman"/>
+          <w:sz w:val="22"/>
+        </w:rPr>
+        <w:t>Sistem QR-Code: Penambahan QR-code generator pada inventaris fisik untuk mempermudah proses verifikasi serah terima barang antara mahasiswa dan staf sarpras saat melakukan peminjaman atau pengembalian.</w:t>
+      </w:r>
+    </w:p>
+    <w:p>
+      <w:pPr>
+        <w:pStyle w:val="ListBullet"/>
+        <w:spacing w:line="276" w:lineRule="auto" w:after="120"/>
+        <w:ind w:left="360"/>
+        <w:jc w:val="both"/>
+      </w:pPr>
+      <w:r>
+        <w:rPr>
+          <w:rFonts w:ascii="Times New Roman" w:hAnsi="Times New Roman"/>
+          <w:sz w:val="22"/>
+        </w:rPr>
+        <w:t>Sistem Denda &amp; Pelanggaran Otomatis: Mengintegrasikan penghitungan denda keterlambatan secara otomatis berdasarkan durasi peminjaman untuk meningkatkan kedisiplinan peminjam.</w:t>
+      </w:r>
     </w:p>
     <w:sectPr>
       <w:pgSz w:w="11910" w:h="16840"/>

</xml_diff>